<commit_message>
Calibri instead of Inter across the handouts
Same change as 318P. Inter is not installed on most machines, so Word
substituted a font with different metrics and the handouts repaginated
depending on who opened them. Calibri ships with Office and was already
these documents' fallback default. 12 files.

The Topic Brainstorming Worksheet also had a paragraph whose only content
was a page break. The break now sits on the following paragraph as
pageBreakBefore, so the layout is unchanged and the stray paragraph is
gone. It still shows an empty page 2 under real Calibri metrics, which is
answer space overflowing rather than a stray break.

No wording changed. Verified by extracting every w:t and diffing against
HEAD: 12 files modified, 0 with any text difference.

Co-Authored-By: Claude Opus 5 (1M context) <noreply@anthropic.com>
</commit_message>
<xml_diff>
--- a/week-01-trust-the-gush/OP1 Why You Write.docx
+++ b/week-01-trust-the-gush/OP1 Why You Write.docx
@@ -227,7 +227,7 @@
         <w:ind w:left="720" w:right="0" w:hanging="360"/>
         <w:jc w:val="left"/>
         <w:rPr>
-          <w:rFonts w:ascii="Inter" w:cs="Inter" w:eastAsia="Inter" w:hAnsi="Inter"/>
+          <w:rFonts w:ascii="Calibri" w:cs="Calibri" w:eastAsia="Calibri" w:hAnsi="Calibri"/>
           <w:i w:val="0"/>
           <w:iCs w:val="0"/>
           <w:smallCaps w:val="0"/>
@@ -242,7 +242,7 @@
       </w:pPr>
       <w:r>
         <w:rPr>
-          <w:rFonts w:ascii="Inter" w:cs="Inter" w:eastAsia="Inter" w:hAnsi="Inter"/>
+          <w:rFonts w:ascii="Calibri" w:cs="Calibri" w:eastAsia="Calibri" w:hAnsi="Calibri"/>
           <w:b w:val="0"/>
           <w:bCs w:val="0"/>
           <w:i w:val="0"/>
@@ -282,7 +282,7 @@
         <w:ind w:left="720" w:right="0" w:hanging="360"/>
         <w:jc w:val="left"/>
         <w:rPr>
-          <w:rFonts w:ascii="Inter" w:cs="Inter" w:eastAsia="Inter" w:hAnsi="Inter"/>
+          <w:rFonts w:ascii="Calibri" w:cs="Calibri" w:eastAsia="Calibri" w:hAnsi="Calibri"/>
           <w:i w:val="0"/>
           <w:iCs w:val="0"/>
           <w:smallCaps w:val="0"/>
@@ -297,7 +297,7 @@
       </w:pPr>
       <w:r>
         <w:rPr>
-          <w:rFonts w:ascii="Inter" w:cs="Inter" w:eastAsia="Inter" w:hAnsi="Inter"/>
+          <w:rFonts w:ascii="Calibri" w:cs="Calibri" w:eastAsia="Calibri" w:hAnsi="Calibri"/>
           <w:b w:val="0"/>
           <w:bCs w:val="0"/>
           <w:i w:val="0"/>
@@ -337,7 +337,7 @@
         <w:ind w:left="720" w:right="0" w:hanging="360"/>
         <w:jc w:val="left"/>
         <w:rPr>
-          <w:rFonts w:ascii="Inter" w:cs="Inter" w:eastAsia="Inter" w:hAnsi="Inter"/>
+          <w:rFonts w:ascii="Calibri" w:cs="Calibri" w:eastAsia="Calibri" w:hAnsi="Calibri"/>
           <w:i w:val="0"/>
           <w:iCs w:val="0"/>
           <w:smallCaps w:val="0"/>
@@ -352,7 +352,7 @@
       </w:pPr>
       <w:r>
         <w:rPr>
-          <w:rFonts w:ascii="Inter" w:cs="Inter" w:eastAsia="Inter" w:hAnsi="Inter"/>
+          <w:rFonts w:ascii="Calibri" w:cs="Calibri" w:eastAsia="Calibri" w:hAnsi="Calibri"/>
           <w:b w:val="0"/>
           <w:bCs w:val="0"/>
           <w:i w:val="0"/>
@@ -993,7 +993,7 @@
   <w:docDefaults>
     <w:rPrDefault>
       <w:rPr>
-        <w:rFonts w:ascii="Inter" w:cs="Inter" w:eastAsia="Inter" w:hAnsi="Inter"/>
+        <w:rFonts w:ascii="Calibri" w:cs="Calibri" w:eastAsia="Calibri" w:hAnsi="Calibri"/>
         <w:sz w:val="22"/>
         <w:szCs w:val="22"/>
         <w:lang w:val="en"/>
@@ -1029,7 +1029,7 @@
       <w:spacing w:after="0" w:before="0" w:lineRule="auto"/>
     </w:pPr>
     <w:rPr>
-      <w:rFonts w:ascii="Inter" w:cs="Inter" w:eastAsia="Inter" w:hAnsi="Inter"/>
+      <w:rFonts w:ascii="Calibri" w:cs="Calibri" w:eastAsia="Calibri" w:hAnsi="Calibri"/>
       <w:b w:val="1"/>
       <w:bCs w:val="1"/>
       <w:color w:val="366091"/>
@@ -1047,7 +1047,7 @@
       <w:spacing w:after="0" w:before="200" w:lineRule="auto"/>
     </w:pPr>
     <w:rPr>
-      <w:rFonts w:ascii="Inter" w:cs="Inter" w:eastAsia="Inter" w:hAnsi="Inter"/>
+      <w:rFonts w:ascii="Calibri" w:cs="Calibri" w:eastAsia="Calibri" w:hAnsi="Calibri"/>
       <w:b w:val="1"/>
       <w:bCs w:val="1"/>
       <w:color w:val="4f81bd"/>
@@ -1130,7 +1130,7 @@
       <w:spacing w:after="300" w:line="240" w:lineRule="auto"/>
     </w:pPr>
     <w:rPr>
-      <w:rFonts w:ascii="Inter" w:cs="Inter" w:eastAsia="Inter" w:hAnsi="Inter"/>
+      <w:rFonts w:ascii="Calibri" w:cs="Calibri" w:eastAsia="Calibri" w:hAnsi="Calibri"/>
       <w:color w:val="17365d"/>
       <w:sz w:val="52"/>
       <w:szCs w:val="52"/>

</xml_diff>

<commit_message>
The handouts say reflecting with the AI is a choice
OP1 through OP4 each stated that Journaler's reflection partner asks
how the writing went, as a description of what happens. Journaler no
longer works that way: with no provider connected the student writes
the commentary themselves, in the same box, and it prints on the same
record.

All four now read: "After the gush, you have the opportunity to
reflect — either on your own or with Journaler's onboard AI reflection
partner. Turn AI on or off to access each option."

OP5 never carried the sentence and is untouched.

Co-Authored-By: Claude Opus 5 (1M context) <noreply@anthropic.com>
</commit_message>
<xml_diff>
--- a/week-01-trust-the-gush/OP1 Why You Write.docx
+++ b/week-01-trust-the-gush/OP1 Why You Write.docx
@@ -436,13 +436,13 @@
           <w:highlight w:val="yellow"/>
           <w:rtl w:val="0"/>
         </w:rPr>
-        <w:t xml:space="preserve">This One-Pager is your own writing, drafted live in Journaler.</w:t>
-      </w:r>
-      <w:r>
-        <w:rPr>
-          <w:rtl w:val="0"/>
-        </w:rPr>
-        <w:t xml:space="preserve"> You’ll write alongside your classmates, but the words are yours. After the buzzer, Journaler’s reflection partner asks how the writing went — about the experience, not the content. It never supplies your words. The thinking here has to be yours, and that is the whole point.</w:t>
+        <w:t xml:space="preserve">After the gush, you have the opportunity to reflect — either on your own or with Journaler’s onboard AI reflection partner. Turn AI on or off to access each option.</w:t>
+      </w:r>
+      <w:r>
+        <w:rPr>
+          <w:rtl w:val="0"/>
+        </w:rPr>
+        <w:t xml:space="preserve"/>
       </w:r>
     </w:p>
     <w:p>

</xml_diff>